<commit_message>
Polish brief CV designs with full-face photos and one-page balance.
Refine photo crops so hair and face stay complete, and tighten elegant one-page layouts across all five versions.

Co-authored-by: Cursor <cursoragent@cursor.com>
</commit_message>
<xml_diff>
--- a/racheal_cv/brief_versions/01_classic_airy/racheal_cv.docx
+++ b/racheal_cv/brief_versions/01_classic_airy/racheal_cv.docx
@@ -8,21 +8,22 @@
         <w:tblLook w:firstColumn="1" w:firstRow="1" w:lastColumn="0" w:lastRow="0" w:noHBand="0" w:noVBand="1" w:val="04A0"/>
       </w:tblPr>
       <w:tblGrid>
-        <w:gridCol w:w="5100"/>
-        <w:gridCol w:w="5100"/>
+        <w:gridCol w:w="5270"/>
+        <w:gridCol w:w="5270"/>
       </w:tblGrid>
       <w:tr>
         <w:tc>
           <w:tcPr>
-            <w:tcW w:type="dxa" w:w="5100"/>
+            <w:tcW w:type="dxa" w:w="5270"/>
+            <w:shd w:fill="F8F5F0" w:val="clear"/>
           </w:tcPr>
           <w:p>
             <w:r>
               <w:rPr>
                 <w:rFonts w:ascii="Calibri" w:hAnsi="Calibri" w:eastAsia="Calibri"/>
                 <w:b/>
-                <w:color w:val="0B3D5C"/>
-                <w:sz w:val="36"/>
+                <w:color w:val="0A3A52"/>
+                <w:sz w:val="30"/>
               </w:rPr>
               <w:t>RACHEAL NABUKEERA SEKAGIRI</w:t>
             </w:r>
@@ -32,10 +33,10 @@
               <w:rPr>
                 <w:rFonts w:ascii="Calibri" w:hAnsi="Calibri" w:eastAsia="Calibri"/>
                 <w:b w:val="0"/>
-                <w:color w:val="1A6B7A"/>
-                <w:sz w:val="20"/>
+                <w:color w:val="1F6F78"/>
+                <w:sz w:val="18"/>
               </w:rPr>
-              <w:t>Senior Human Resource Executive | Human Capital Strategist</w:t>
+              <w:t>Senior Human Resource Executive  ·  Human Capital Strategist</w:t>
             </w:r>
           </w:p>
           <w:p>
@@ -46,8 +47,8 @@
               <w:rPr>
                 <w:rFonts w:ascii="Calibri" w:hAnsi="Calibri" w:eastAsia="Calibri"/>
                 <w:b w:val="0"/>
-                <w:color w:val="627D98"/>
-                <w:sz w:val="18"/>
+                <w:color w:val="5B6B7C"/>
+                <w:sz w:val="17"/>
               </w:rPr>
               <w:t>Kampala, Uganda</w:t>
             </w:r>
@@ -60,10 +61,10 @@
               <w:rPr>
                 <w:rFonts w:ascii="Calibri" w:hAnsi="Calibri" w:eastAsia="Calibri"/>
                 <w:b w:val="0"/>
-                <w:color w:val="627D98"/>
-                <w:sz w:val="18"/>
+                <w:color w:val="5B6B7C"/>
+                <w:sz w:val="17"/>
               </w:rPr>
-              <w:t>Mobile: +256 772 849258 | +256 701 849258</w:t>
+              <w:t>+256 772 849258  ·  +256 701 849258</w:t>
             </w:r>
           </w:p>
           <w:p>
@@ -74,30 +75,17 @@
               <w:rPr>
                 <w:rFonts w:ascii="Calibri" w:hAnsi="Calibri" w:eastAsia="Calibri"/>
                 <w:b w:val="0"/>
-                <w:color w:val="627D98"/>
-                <w:sz w:val="18"/>
+                <w:color w:val="5B6B7C"/>
+                <w:sz w:val="17"/>
               </w:rPr>
-              <w:t>Email: info@fairbanksmedicalcentre.org</w:t>
-            </w:r>
-          </w:p>
-          <w:p>
-            <w:pPr>
-              <w:spacing w:after="0"/>
-            </w:pPr>
-            <w:r>
-              <w:rPr>
-                <w:rFonts w:ascii="Calibri" w:hAnsi="Calibri" w:eastAsia="Calibri"/>
-                <w:b w:val="0"/>
-                <w:color w:val="627D98"/>
-                <w:sz w:val="18"/>
-              </w:rPr>
-              <w:t>Web: www.fairbanksmedicalcentre.org</w:t>
+              <w:t>info@fairbanksmedicalcentre.org  ·  www.fairbanksmedicalcentre.org</w:t>
             </w:r>
           </w:p>
         </w:tc>
         <w:tc>
           <w:tcPr>
-            <w:tcW w:type="dxa" w:w="5100"/>
+            <w:tcW w:type="dxa" w:w="5270"/>
+            <w:shd w:fill="F8F5F0" w:val="clear"/>
           </w:tcPr>
           <w:p>
             <w:pPr>
@@ -106,7 +94,7 @@
             <w:r>
               <w:drawing>
                 <wp:inline xmlns:a="http://schemas.openxmlformats.org/drawingml/2006/main" xmlns:pic="http://schemas.openxmlformats.org/drawingml/2006/picture">
-                  <wp:extent cx="1051560" cy="1051560"/>
+                  <wp:extent cx="1143000" cy="1143000"/>
                   <wp:docPr id="1" name="Picture 1"/>
                   <wp:cNvGraphicFramePr>
                     <a:graphicFrameLocks noChangeAspect="1"/>
@@ -127,7 +115,7 @@
                         <pic:spPr>
                           <a:xfrm>
                             <a:off x="0" y="0"/>
-                            <a:ext cx="1051560" cy="1051560"/>
+                            <a:ext cx="1143000" cy="1143000"/>
                           </a:xfrm>
                           <a:prstGeom prst="rect"/>
                         </pic:spPr>
@@ -143,110 +131,187 @@
     </w:tbl>
     <w:p>
       <w:pPr>
-        <w:spacing w:before="200" w:after="80"/>
+        <w:spacing w:before="160" w:after="60"/>
         <w:pBdr>
-          <w:bottom w:val="single" w:sz="10" w:space="1" w:color="C9A227"/>
+          <w:bottom w:val="single" w:sz="10" w:space="1" w:color="B8953E"/>
         </w:pBdr>
       </w:pPr>
       <w:r>
         <w:rPr>
           <w:rFonts w:ascii="Calibri" w:hAnsi="Calibri" w:eastAsia="Calibri"/>
           <w:b/>
-          <w:color w:val="0B3D5C"/>
-          <w:sz w:val="22"/>
+          <w:color w:val="0A3A52"/>
+          <w:sz w:val="20"/>
         </w:rPr>
         <w:t>PROFILE</w:t>
       </w:r>
     </w:p>
     <w:p>
       <w:pPr>
-        <w:spacing w:after="100" w:line="276" w:lineRule="auto"/>
+        <w:spacing w:after="60"/>
         <w:jc w:val="both"/>
       </w:pPr>
       <w:r>
         <w:rPr>
           <w:rFonts w:ascii="Calibri" w:hAnsi="Calibri" w:eastAsia="Calibri"/>
           <w:b w:val="0"/>
-          <w:color w:val="243B53"/>
-          <w:sz w:val="20"/>
+          <w:color w:val="1F2A37"/>
+          <w:sz w:val="19"/>
         </w:rPr>
-        <w:t>Strategic HR executive with nearly 30 years of experience and over 18 years in executive HR leadership. Aligns people strategy with organisational performance across complex institutions.</w:t>
+        <w:t>Strategic HR executive with nearly 30 years of experience and over 18 years in executive leadership. Aligns people strategy with organisational performance. Founder &amp; Managing Director, FairBanks Medical Centre Ltd. Formerly led Group HR for 2,000+ employees across 50+ units. PhD Candidate researching AI prediction of occupational burnout.</w:t>
       </w:r>
     </w:p>
     <w:p>
       <w:pPr>
-        <w:spacing w:after="100" w:line="276" w:lineRule="auto"/>
+        <w:spacing w:before="160" w:after="60"/>
+        <w:pBdr>
+          <w:bottom w:val="single" w:sz="10" w:space="1" w:color="B8953E"/>
+        </w:pBdr>
+      </w:pPr>
+      <w:r>
+        <w:rPr>
+          <w:rFonts w:ascii="Calibri" w:hAnsi="Calibri" w:eastAsia="Calibri"/>
+          <w:b/>
+          <w:color w:val="0A3A52"/>
+          <w:sz w:val="20"/>
+        </w:rPr>
+        <w:t>HIGHLIGHTS</w:t>
+      </w:r>
+    </w:p>
+    <w:p>
+      <w:pPr>
+        <w:pStyle w:val="ListBullet"/>
+        <w:spacing w:after="20"/>
+      </w:pPr>
+      <w:r>
+        <w:rPr>
+          <w:rFonts w:ascii="Calibri" w:hAnsi="Calibri" w:eastAsia="Calibri"/>
+          <w:b w:val="0"/>
+          <w:color w:val="1F2A37"/>
+          <w:sz w:val="18"/>
+        </w:rPr>
+        <w:t>30 years progressive HR &amp; executive management</w:t>
+      </w:r>
+    </w:p>
+    <w:p>
+      <w:pPr>
+        <w:pStyle w:val="ListBullet"/>
+        <w:spacing w:after="20"/>
+      </w:pPr>
+      <w:r>
+        <w:rPr>
+          <w:rFonts w:ascii="Calibri" w:hAnsi="Calibri" w:eastAsia="Calibri"/>
+          <w:b w:val="0"/>
+          <w:color w:val="1F2A37"/>
+          <w:sz w:val="18"/>
+        </w:rPr>
+        <w:t>18+ years executive Human Resource leadership</w:t>
+      </w:r>
+    </w:p>
+    <w:p>
+      <w:pPr>
+        <w:pStyle w:val="ListBullet"/>
+        <w:spacing w:after="20"/>
+      </w:pPr>
+      <w:r>
+        <w:rPr>
+          <w:rFonts w:ascii="Calibri" w:hAnsi="Calibri" w:eastAsia="Calibri"/>
+          <w:b w:val="0"/>
+          <w:color w:val="1F2A37"/>
+          <w:sz w:val="18"/>
+        </w:rPr>
+        <w:t>HR leadership for 2,000+ staff across 50+ units</w:t>
+      </w:r>
+    </w:p>
+    <w:p>
+      <w:pPr>
+        <w:pStyle w:val="ListBullet"/>
+        <w:spacing w:after="20"/>
+      </w:pPr>
+      <w:r>
+        <w:rPr>
+          <w:rFonts w:ascii="Calibri" w:hAnsi="Calibri" w:eastAsia="Calibri"/>
+          <w:b w:val="0"/>
+          <w:color w:val="1F2A37"/>
+          <w:sz w:val="18"/>
+        </w:rPr>
+        <w:t>Founder &amp; MD, FairBanks Medical Centre Ltd</w:t>
+      </w:r>
+    </w:p>
+    <w:p>
+      <w:pPr>
+        <w:pStyle w:val="ListBullet"/>
+        <w:spacing w:after="20"/>
+      </w:pPr>
+      <w:r>
+        <w:rPr>
+          <w:rFonts w:ascii="Calibri" w:hAnsi="Calibri" w:eastAsia="Calibri"/>
+          <w:b w:val="0"/>
+          <w:color w:val="1F2A37"/>
+          <w:sz w:val="18"/>
+        </w:rPr>
+        <w:t>Social enterprise reach: 10,000+ beneficiaries</w:t>
+      </w:r>
+    </w:p>
+    <w:p>
+      <w:pPr>
+        <w:spacing w:before="160" w:after="60"/>
+        <w:pBdr>
+          <w:bottom w:val="single" w:sz="10" w:space="1" w:color="B8953E"/>
+        </w:pBdr>
+      </w:pPr>
+      <w:r>
+        <w:rPr>
+          <w:rFonts w:ascii="Calibri" w:hAnsi="Calibri" w:eastAsia="Calibri"/>
+          <w:b/>
+          <w:color w:val="0A3A52"/>
+          <w:sz w:val="20"/>
+        </w:rPr>
+        <w:t>CORE COMPETENCIES</w:t>
+      </w:r>
+    </w:p>
+    <w:p>
+      <w:pPr>
+        <w:spacing w:after="60"/>
         <w:jc w:val="both"/>
       </w:pPr>
       <w:r>
         <w:rPr>
           <w:rFonts w:ascii="Calibri" w:hAnsi="Calibri" w:eastAsia="Calibri"/>
           <w:b w:val="0"/>
-          <w:color w:val="243B53"/>
-          <w:sz w:val="20"/>
+          <w:color w:val="1F2A37"/>
+          <w:sz w:val="19"/>
         </w:rPr>
-        <w:t>Founder and Managing Director, FairBanks Medical Centre Ltd. Formerly led Group HR for 2,000+ employees across 50+ departments. PhD Candidate (Management) researching AI prediction of occupational burnout.</w:t>
+        <w:t>HR Strategy  ·  Organisational Development  ·  Talent Management  ·  Workforce Planning  ·  Change Management  ·  Performance Management  ·  Employee Relations  ·  Corporate Governance  ·  Leadership Development  ·  HR Analytics / HRIS</w:t>
       </w:r>
     </w:p>
     <w:p>
       <w:pPr>
-        <w:spacing w:before="200" w:after="80"/>
+        <w:spacing w:before="160" w:after="60"/>
         <w:pBdr>
-          <w:bottom w:val="single" w:sz="10" w:space="1" w:color="C9A227"/>
+          <w:bottom w:val="single" w:sz="10" w:space="1" w:color="B8953E"/>
         </w:pBdr>
       </w:pPr>
       <w:r>
         <w:rPr>
           <w:rFonts w:ascii="Calibri" w:hAnsi="Calibri" w:eastAsia="Calibri"/>
           <w:b/>
-          <w:color w:val="0B3D5C"/>
-          <w:sz w:val="22"/>
-        </w:rPr>
-        <w:t>CORE COMPETENCIES</w:t>
-      </w:r>
-    </w:p>
-    <w:p>
-      <w:pPr>
-        <w:spacing w:after="100" w:line="276" w:lineRule="auto"/>
-        <w:jc w:val="both"/>
-      </w:pPr>
-      <w:r>
-        <w:rPr>
-          <w:rFonts w:ascii="Calibri" w:hAnsi="Calibri" w:eastAsia="Calibri"/>
-          <w:b w:val="0"/>
-          <w:color w:val="243B53"/>
+          <w:color w:val="0A3A52"/>
           <w:sz w:val="20"/>
-        </w:rPr>
-        <w:t>HR Strategy  ·  Organisational Development  ·  Talent Management  ·  Workforce Planning  ·  Change Management  ·  Performance Management  ·  Employee Relations  ·  Corporate Governance  ·  Leadership Development  ·  HR Analytics / HRIS</w:t>
-      </w:r>
-    </w:p>
-    <w:p>
-      <w:pPr>
-        <w:spacing w:before="200" w:after="80"/>
-        <w:pBdr>
-          <w:bottom w:val="single" w:sz="10" w:space="1" w:color="C9A227"/>
-        </w:pBdr>
-      </w:pPr>
-      <w:r>
-        <w:rPr>
-          <w:rFonts w:ascii="Calibri" w:hAnsi="Calibri" w:eastAsia="Calibri"/>
-          <w:b/>
-          <w:color w:val="0B3D5C"/>
-          <w:sz w:val="22"/>
         </w:rPr>
         <w:t>EXPERIENCE</w:t>
       </w:r>
     </w:p>
     <w:p>
       <w:pPr>
-        <w:spacing w:before="160"/>
+        <w:spacing w:before="80"/>
       </w:pPr>
       <w:r>
         <w:rPr>
           <w:rFonts w:ascii="Calibri" w:hAnsi="Calibri" w:eastAsia="Calibri"/>
           <w:b/>
-          <w:color w:val="0B3D5C"/>
-          <w:sz w:val="22"/>
+          <w:color w:val="0A3A52"/>
+          <w:sz w:val="19"/>
         </w:rPr>
         <w:t>Founder, Managing Director &amp; Executive HR Leader</w:t>
       </w:r>
@@ -256,52 +321,37 @@
         <w:rPr>
           <w:rFonts w:ascii="Calibri" w:hAnsi="Calibri" w:eastAsia="Calibri"/>
           <w:b w:val="0"/>
-          <w:color w:val="1A6B7A"/>
-          <w:sz w:val="20"/>
+          <w:color w:val="1F6F78"/>
+          <w:sz w:val="17"/>
         </w:rPr>
         <w:t>FairBanks Medical Centre Ltd  |  2025 - Present</w:t>
       </w:r>
     </w:p>
     <w:p>
       <w:pPr>
-        <w:pStyle w:val="ListBullet"/>
-        <w:spacing w:after="40"/>
+        <w:spacing w:after="60"/>
+        <w:jc w:val="both"/>
       </w:pPr>
       <w:r>
         <w:rPr>
           <w:rFonts w:ascii="Calibri" w:hAnsi="Calibri" w:eastAsia="Calibri"/>
           <w:b w:val="0"/>
-          <w:color w:val="243B53"/>
-          <w:sz w:val="19"/>
+          <w:color w:val="1F2A37"/>
+          <w:sz w:val="18"/>
         </w:rPr>
-        <w:t>Lead strategy, governance, HR and institutional growth.</w:t>
+        <w:t>Strategy, governance, HR and growth; founded social enterprise (10,000+ beneficiaries).</w:t>
       </w:r>
     </w:p>
     <w:p>
       <w:pPr>
-        <w:pStyle w:val="ListBullet"/>
-        <w:spacing w:after="40"/>
-      </w:pPr>
-      <w:r>
-        <w:rPr>
-          <w:rFonts w:ascii="Calibri" w:hAnsi="Calibri" w:eastAsia="Calibri"/>
-          <w:b w:val="0"/>
-          <w:color w:val="243B53"/>
-          <w:sz w:val="19"/>
-        </w:rPr>
-        <w:t>Founded social enterprise initiative (10,000+ beneficiaries).</w:t>
-      </w:r>
-    </w:p>
-    <w:p>
-      <w:pPr>
-        <w:spacing w:before="160"/>
+        <w:spacing w:before="80"/>
       </w:pPr>
       <w:r>
         <w:rPr>
           <w:rFonts w:ascii="Calibri" w:hAnsi="Calibri" w:eastAsia="Calibri"/>
           <w:b/>
-          <w:color w:val="0B3D5C"/>
-          <w:sz w:val="22"/>
+          <w:color w:val="0A3A52"/>
+          <w:sz w:val="19"/>
         </w:rPr>
         <w:t>Group Human Resource &amp; Administration Manager</w:t>
       </w:r>
@@ -311,52 +361,37 @@
         <w:rPr>
           <w:rFonts w:ascii="Calibri" w:hAnsi="Calibri" w:eastAsia="Calibri"/>
           <w:b w:val="0"/>
-          <w:color w:val="1A6B7A"/>
-          <w:sz w:val="20"/>
+          <w:color w:val="1F6F78"/>
+          <w:sz w:val="17"/>
         </w:rPr>
         <w:t>Norvik Group  |  Jul 2016 - Feb 2026</w:t>
       </w:r>
     </w:p>
     <w:p>
       <w:pPr>
-        <w:pStyle w:val="ListBullet"/>
-        <w:spacing w:after="40"/>
+        <w:spacing w:after="60"/>
+        <w:jc w:val="both"/>
       </w:pPr>
       <w:r>
         <w:rPr>
           <w:rFonts w:ascii="Calibri" w:hAnsi="Calibri" w:eastAsia="Calibri"/>
           <w:b w:val="0"/>
-          <w:color w:val="243B53"/>
-          <w:sz w:val="19"/>
+          <w:color w:val="1F2A37"/>
+          <w:sz w:val="18"/>
         </w:rPr>
-        <w:t>Directed Group HR for 2,000+ employees across 50+ units.</w:t>
+        <w:t>Directed Group HR for 2,000+ employees; led workforce planning and leadership development.</w:t>
       </w:r>
     </w:p>
     <w:p>
       <w:pPr>
-        <w:pStyle w:val="ListBullet"/>
-        <w:spacing w:after="40"/>
-      </w:pPr>
-      <w:r>
-        <w:rPr>
-          <w:rFonts w:ascii="Calibri" w:hAnsi="Calibri" w:eastAsia="Calibri"/>
-          <w:b w:val="0"/>
-          <w:color w:val="243B53"/>
-          <w:sz w:val="19"/>
-        </w:rPr>
-        <w:t>Led workforce planning, restructuring and leadership development.</w:t>
-      </w:r>
-    </w:p>
-    <w:p>
-      <w:pPr>
-        <w:spacing w:before="160"/>
+        <w:spacing w:before="80"/>
       </w:pPr>
       <w:r>
         <w:rPr>
           <w:rFonts w:ascii="Calibri" w:hAnsi="Calibri" w:eastAsia="Calibri"/>
           <w:b/>
-          <w:color w:val="0B3D5C"/>
-          <w:sz w:val="22"/>
+          <w:color w:val="0A3A52"/>
+          <w:sz w:val="19"/>
         </w:rPr>
         <w:t>Human Resource &amp; Administration Manager</w:t>
       </w:r>
@@ -366,37 +401,37 @@
         <w:rPr>
           <w:rFonts w:ascii="Calibri" w:hAnsi="Calibri" w:eastAsia="Calibri"/>
           <w:b w:val="0"/>
-          <w:color w:val="1A6B7A"/>
-          <w:sz w:val="20"/>
+          <w:color w:val="1F6F78"/>
+          <w:sz w:val="17"/>
         </w:rPr>
         <w:t>Norvik Hospital Ltd  |  Sep 2013 - 2016</w:t>
       </w:r>
     </w:p>
     <w:p>
       <w:pPr>
-        <w:pStyle w:val="ListBullet"/>
-        <w:spacing w:after="40"/>
+        <w:spacing w:after="60"/>
+        <w:jc w:val="both"/>
       </w:pPr>
       <w:r>
         <w:rPr>
           <w:rFonts w:ascii="Calibri" w:hAnsi="Calibri" w:eastAsia="Calibri"/>
           <w:b w:val="0"/>
-          <w:color w:val="243B53"/>
-          <w:sz w:val="19"/>
+          <w:color w:val="1F2A37"/>
+          <w:sz w:val="18"/>
         </w:rPr>
-        <w:t>Led recruitment, employee relations and performance systems.</w:t>
+        <w:t>Led recruitment, employee relations, performance systems and HR policy.</w:t>
       </w:r>
     </w:p>
     <w:p>
       <w:pPr>
-        <w:spacing w:before="160"/>
+        <w:spacing w:before="80"/>
       </w:pPr>
       <w:r>
         <w:rPr>
           <w:rFonts w:ascii="Calibri" w:hAnsi="Calibri" w:eastAsia="Calibri"/>
           <w:b/>
-          <w:color w:val="0B3D5C"/>
-          <w:sz w:val="22"/>
+          <w:color w:val="0A3A52"/>
+          <w:sz w:val="19"/>
         </w:rPr>
         <w:t>Human Resource Manager</w:t>
       </w:r>
@@ -406,172 +441,109 @@
         <w:rPr>
           <w:rFonts w:ascii="Calibri" w:hAnsi="Calibri" w:eastAsia="Calibri"/>
           <w:b w:val="0"/>
-          <w:color w:val="1A6B7A"/>
-          <w:sz w:val="20"/>
+          <w:color w:val="1F6F78"/>
+          <w:sz w:val="17"/>
         </w:rPr>
         <w:t>St. Catherine's Hospital  |  2007 - 2010</w:t>
       </w:r>
     </w:p>
     <w:p>
       <w:pPr>
-        <w:pStyle w:val="ListBullet"/>
-        <w:spacing w:after="40"/>
+        <w:spacing w:after="60"/>
+        <w:jc w:val="both"/>
       </w:pPr>
       <w:r>
         <w:rPr>
           <w:rFonts w:ascii="Calibri" w:hAnsi="Calibri" w:eastAsia="Calibri"/>
           <w:b w:val="0"/>
-          <w:color w:val="243B53"/>
-          <w:sz w:val="19"/>
+          <w:color w:val="1F2A37"/>
+          <w:sz w:val="18"/>
         </w:rPr>
         <w:t>Managed HR operations, welfare and labour compliance.</w:t>
       </w:r>
     </w:p>
     <w:p>
       <w:pPr>
-        <w:spacing w:after="100" w:line="276" w:lineRule="auto"/>
+        <w:spacing w:after="60"/>
         <w:jc w:val="both"/>
       </w:pPr>
       <w:r>
         <w:rPr>
           <w:rFonts w:ascii="Calibri" w:hAnsi="Calibri" w:eastAsia="Calibri"/>
           <w:b w:val="0"/>
-          <w:color w:val="627D98"/>
-          <w:sz w:val="20"/>
+          <w:color w:val="5B6B7C"/>
+          <w:sz w:val="16"/>
         </w:rPr>
         <w:t>Earlier: Health Systems Administrator, St. Catherine's (2010-2013); HR Assistant, E Power Limited (1997-2000).</w:t>
       </w:r>
     </w:p>
     <w:p>
       <w:pPr>
-        <w:spacing w:before="200" w:after="80"/>
+        <w:spacing w:before="160" w:after="60"/>
         <w:pBdr>
-          <w:bottom w:val="single" w:sz="10" w:space="1" w:color="C9A227"/>
+          <w:bottom w:val="single" w:sz="10" w:space="1" w:color="B8953E"/>
         </w:pBdr>
       </w:pPr>
       <w:r>
         <w:rPr>
           <w:rFonts w:ascii="Calibri" w:hAnsi="Calibri" w:eastAsia="Calibri"/>
           <w:b/>
-          <w:color w:val="0B3D5C"/>
-          <w:sz w:val="22"/>
+          <w:color w:val="0A3A52"/>
+          <w:sz w:val="20"/>
         </w:rPr>
         <w:t>EDUCATION</w:t>
       </w:r>
     </w:p>
     <w:p>
-      <w:r>
-        <w:rPr>
-          <w:rFonts w:ascii="Calibri" w:hAnsi="Calibri" w:eastAsia="Calibri"/>
-          <w:b/>
-          <w:color w:val="0B3D5C"/>
-          <w:sz w:val="20"/>
-        </w:rPr>
-        <w:t>PhD in Management (Ongoing)</w:t>
-      </w:r>
-    </w:p>
-    <w:p>
       <w:pPr>
-        <w:spacing w:after="100" w:line="276" w:lineRule="auto"/>
+        <w:spacing w:after="60"/>
         <w:jc w:val="both"/>
       </w:pPr>
       <w:r>
         <w:rPr>
           <w:rFonts w:ascii="Calibri" w:hAnsi="Calibri" w:eastAsia="Calibri"/>
           <w:b w:val="0"/>
-          <w:color w:val="627D98"/>
-          <w:sz w:val="20"/>
+          <w:color w:val="1F2A37"/>
+          <w:sz w:val="19"/>
         </w:rPr>
-        <w:t>Uganda Christian University - AI/ML research on occupational burnout in medical practice</w:t>
+        <w:t>PhD Management (Ongoing), Uganda Christian University  ·  MSSPM, Makerere University  ·  BA Social Sciences, Makerere University</w:t>
       </w:r>
     </w:p>
     <w:p>
+      <w:pPr>
+        <w:spacing w:before="160" w:after="60"/>
+        <w:pBdr>
+          <w:bottom w:val="single" w:sz="10" w:space="1" w:color="B8953E"/>
+        </w:pBdr>
+      </w:pPr>
       <w:r>
         <w:rPr>
           <w:rFonts w:ascii="Calibri" w:hAnsi="Calibri" w:eastAsia="Calibri"/>
           <w:b/>
-          <w:color w:val="0B3D5C"/>
+          <w:color w:val="0A3A52"/>
           <w:sz w:val="20"/>
         </w:rPr>
-        <w:t>Master of Social Sector Planning and Management</w:t>
+        <w:t>ADDITIONAL</w:t>
       </w:r>
     </w:p>
     <w:p>
       <w:pPr>
-        <w:spacing w:after="100" w:line="276" w:lineRule="auto"/>
+        <w:spacing w:after="60"/>
         <w:jc w:val="both"/>
       </w:pPr>
       <w:r>
         <w:rPr>
           <w:rFonts w:ascii="Calibri" w:hAnsi="Calibri" w:eastAsia="Calibri"/>
           <w:b w:val="0"/>
-          <w:color w:val="627D98"/>
-          <w:sz w:val="20"/>
+          <w:color w:val="5B6B7C"/>
+          <w:sz w:val="17"/>
         </w:rPr>
-        <w:t>Makerere University</w:t>
-      </w:r>
-    </w:p>
-    <w:p>
-      <w:r>
-        <w:rPr>
-          <w:rFonts w:ascii="Calibri" w:hAnsi="Calibri" w:eastAsia="Calibri"/>
-          <w:b/>
-          <w:color w:val="0B3D5C"/>
-          <w:sz w:val="20"/>
-        </w:rPr>
-        <w:t>Bachelor of Arts in Social Sciences</w:t>
-      </w:r>
-    </w:p>
-    <w:p>
-      <w:pPr>
-        <w:spacing w:after="100" w:line="276" w:lineRule="auto"/>
-        <w:jc w:val="both"/>
-      </w:pPr>
-      <w:r>
-        <w:rPr>
-          <w:rFonts w:ascii="Calibri" w:hAnsi="Calibri" w:eastAsia="Calibri"/>
-          <w:b w:val="0"/>
-          <w:color w:val="627D98"/>
-          <w:sz w:val="20"/>
-        </w:rPr>
-        <w:t>Makerere University</w:t>
-      </w:r>
-    </w:p>
-    <w:p>
-      <w:pPr>
-        <w:spacing w:before="200" w:after="80"/>
-        <w:pBdr>
-          <w:bottom w:val="single" w:sz="10" w:space="1" w:color="C9A227"/>
-        </w:pBdr>
-      </w:pPr>
-      <w:r>
-        <w:rPr>
-          <w:rFonts w:ascii="Calibri" w:hAnsi="Calibri" w:eastAsia="Calibri"/>
-          <w:b/>
-          <w:color w:val="0B3D5C"/>
-          <w:sz w:val="22"/>
-        </w:rPr>
-        <w:t>ADDITIONAL</w:t>
-      </w:r>
-    </w:p>
-    <w:p>
-      <w:pPr>
-        <w:spacing w:after="100" w:line="276" w:lineRule="auto"/>
-        <w:jc w:val="both"/>
-      </w:pPr>
-      <w:r>
-        <w:rPr>
-          <w:rFonts w:ascii="Calibri" w:hAnsi="Calibri" w:eastAsia="Calibri"/>
-          <w:b w:val="0"/>
-          <w:color w:val="243B53"/>
-          <w:sz w:val="20"/>
-        </w:rPr>
-        <w:t>Member, FUE  ·  English &amp; Luganda (Fluent)  ·  References on request</w:t>
+        <w:t>Member, Federation of Uganda Employers (FUE)  ·  English &amp; Luganda (Fluent)  ·  References on request</w:t>
       </w:r>
     </w:p>
     <w:sectPr>
       <w:pgSz w:w="12240" w:h="15840"/>
-      <w:pgMar w:top="907" w:right="1020" w:bottom="907" w:left="1020" w:header="720" w:footer="720" w:gutter="0"/>
+      <w:pgMar w:top="794" w:right="850" w:bottom="794" w:left="850" w:header="720" w:footer="720" w:gutter="0"/>
       <w:cols w:space="720"/>
       <w:docGrid w:linePitch="360"/>
     </w:sectPr>

</xml_diff>

<commit_message>
Pack brief one-page CVs with fuller portraits and richer content.
Use complete waist-up photos matching the original portrait, and fill each design with clearer career detail while staying on one page.

Co-authored-by: Cursor <cursoragent@cursor.com>
</commit_message>
<xml_diff>
--- a/racheal_cv/brief_versions/01_classic_airy/racheal_cv.docx
+++ b/racheal_cv/brief_versions/01_classic_airy/racheal_cv.docx
@@ -8,13 +8,13 @@
         <w:tblLook w:firstColumn="1" w:firstRow="1" w:lastColumn="0" w:lastRow="0" w:noHBand="0" w:noVBand="1" w:val="04A0"/>
       </w:tblPr>
       <w:tblGrid>
-        <w:gridCol w:w="5270"/>
-        <w:gridCol w:w="5270"/>
+        <w:gridCol w:w="5440"/>
+        <w:gridCol w:w="5440"/>
       </w:tblGrid>
       <w:tr>
         <w:tc>
           <w:tcPr>
-            <w:tcW w:type="dxa" w:w="5270"/>
+            <w:tcW w:type="dxa" w:w="5440"/>
             <w:shd w:fill="F8F5F0" w:val="clear"/>
           </w:tcPr>
           <w:p>
@@ -23,7 +23,7 @@
                 <w:rFonts w:ascii="Calibri" w:hAnsi="Calibri" w:eastAsia="Calibri"/>
                 <w:b/>
                 <w:color w:val="0A3A52"/>
-                <w:sz w:val="30"/>
+                <w:sz w:val="28"/>
               </w:rPr>
               <w:t>RACHEAL NABUKEERA SEKAGIRI</w:t>
             </w:r>
@@ -34,9 +34,9 @@
                 <w:rFonts w:ascii="Calibri" w:hAnsi="Calibri" w:eastAsia="Calibri"/>
                 <w:b w:val="0"/>
                 <w:color w:val="1F6F78"/>
-                <w:sz w:val="18"/>
+                <w:sz w:val="16"/>
               </w:rPr>
-              <w:t>Senior Human Resource Executive  ·  Human Capital Strategist</w:t>
+              <w:t>Senior Human Resource Executive  ·  Human Capital Strategist  ·  Organisational Development</w:t>
             </w:r>
           </w:p>
           <w:p>
@@ -48,7 +48,7 @@
                 <w:rFonts w:ascii="Calibri" w:hAnsi="Calibri" w:eastAsia="Calibri"/>
                 <w:b w:val="0"/>
                 <w:color w:val="5B6B7C"/>
-                <w:sz w:val="17"/>
+                <w:sz w:val="16"/>
               </w:rPr>
               <w:t>Kampala, Uganda</w:t>
             </w:r>
@@ -62,7 +62,7 @@
                 <w:rFonts w:ascii="Calibri" w:hAnsi="Calibri" w:eastAsia="Calibri"/>
                 <w:b w:val="0"/>
                 <w:color w:val="5B6B7C"/>
-                <w:sz w:val="17"/>
+                <w:sz w:val="16"/>
               </w:rPr>
               <w:t>+256 772 849258  ·  +256 701 849258</w:t>
             </w:r>
@@ -76,7 +76,7 @@
                 <w:rFonts w:ascii="Calibri" w:hAnsi="Calibri" w:eastAsia="Calibri"/>
                 <w:b w:val="0"/>
                 <w:color w:val="5B6B7C"/>
-                <w:sz w:val="17"/>
+                <w:sz w:val="16"/>
               </w:rPr>
               <w:t>info@fairbanksmedicalcentre.org  ·  www.fairbanksmedicalcentre.org</w:t>
             </w:r>
@@ -84,7 +84,7 @@
         </w:tc>
         <w:tc>
           <w:tcPr>
-            <w:tcW w:type="dxa" w:w="5270"/>
+            <w:tcW w:type="dxa" w:w="5440"/>
             <w:shd w:fill="F8F5F0" w:val="clear"/>
           </w:tcPr>
           <w:p>
@@ -94,7 +94,7 @@
             <w:r>
               <w:drawing>
                 <wp:inline xmlns:a="http://schemas.openxmlformats.org/drawingml/2006/main" xmlns:pic="http://schemas.openxmlformats.org/drawingml/2006/picture">
-                  <wp:extent cx="1143000" cy="1143000"/>
+                  <wp:extent cx="1051560" cy="1597996"/>
                   <wp:docPr id="1" name="Picture 1"/>
                   <wp:cNvGraphicFramePr>
                     <a:graphicFrameLocks noChangeAspect="1"/>
@@ -103,7 +103,7 @@
                     <a:graphicData uri="http://schemas.openxmlformats.org/drawingml/2006/picture">
                       <pic:pic>
                         <pic:nvPicPr>
-                          <pic:cNvPr id="0" name="photo_circle.png"/>
+                          <pic:cNvPr id="0" name="photo_portrait.png"/>
                           <pic:cNvPicPr/>
                         </pic:nvPicPr>
                         <pic:blipFill>
@@ -115,7 +115,7 @@
                         <pic:spPr>
                           <a:xfrm>
                             <a:off x="0" y="0"/>
-                            <a:ext cx="1143000" cy="1143000"/>
+                            <a:ext cx="1051560" cy="1597996"/>
                           </a:xfrm>
                           <a:prstGeom prst="rect"/>
                         </pic:spPr>
@@ -131,9 +131,9 @@
     </w:tbl>
     <w:p>
       <w:pPr>
-        <w:spacing w:before="160" w:after="60"/>
+        <w:spacing w:before="120" w:after="40"/>
         <w:pBdr>
-          <w:bottom w:val="single" w:sz="10" w:space="1" w:color="B8953E"/>
+          <w:bottom w:val="single" w:sz="8" w:space="1" w:color="B8953E"/>
         </w:pBdr>
       </w:pPr>
       <w:r>
@@ -141,14 +141,14 @@
           <w:rFonts w:ascii="Calibri" w:hAnsi="Calibri" w:eastAsia="Calibri"/>
           <w:b/>
           <w:color w:val="0A3A52"/>
-          <w:sz w:val="20"/>
+          <w:sz w:val="18"/>
         </w:rPr>
         <w:t>PROFILE</w:t>
       </w:r>
     </w:p>
     <w:p>
       <w:pPr>
-        <w:spacing w:after="60"/>
+        <w:spacing w:after="40"/>
         <w:jc w:val="both"/>
       </w:pPr>
       <w:r>
@@ -156,16 +156,31 @@
           <w:rFonts w:ascii="Calibri" w:hAnsi="Calibri" w:eastAsia="Calibri"/>
           <w:b w:val="0"/>
           <w:color w:val="1F2A37"/>
-          <w:sz w:val="19"/>
+          <w:sz w:val="17"/>
         </w:rPr>
-        <w:t>Strategic HR executive with nearly 30 years of experience and over 18 years in executive leadership. Aligns people strategy with organisational performance. Founder &amp; Managing Director, FairBanks Medical Centre Ltd. Formerly led Group HR for 2,000+ employees across 50+ units. PhD Candidate researching AI prediction of occupational burnout.</w:t>
+        <w:t>Strategic HR executive with nearly 30 years of progressive experience and over 18 years in executive Human Resource leadership. Aligns people, performance and organisational goals across complex institutions.</w:t>
       </w:r>
     </w:p>
     <w:p>
       <w:pPr>
-        <w:spacing w:before="160" w:after="60"/>
+        <w:spacing w:after="40"/>
+        <w:jc w:val="both"/>
+      </w:pPr>
+      <w:r>
+        <w:rPr>
+          <w:rFonts w:ascii="Calibri" w:hAnsi="Calibri" w:eastAsia="Calibri"/>
+          <w:b w:val="0"/>
+          <w:color w:val="1F2A37"/>
+          <w:sz w:val="17"/>
+        </w:rPr>
+        <w:t>Founder &amp; Managing Director, FairBanks Medical Centre Ltd. Formerly directed Group HR for 2,000+ employees across 50+ departments. PhD Candidate (Management) researching AI/ML prediction of occupational burnout among medical practitioners. Member, Federation of Uganda Employers (FUE).</w:t>
+      </w:r>
+    </w:p>
+    <w:p>
+      <w:pPr>
+        <w:spacing w:before="120" w:after="40"/>
         <w:pBdr>
-          <w:bottom w:val="single" w:sz="10" w:space="1" w:color="B8953E"/>
+          <w:bottom w:val="single" w:sz="8" w:space="1" w:color="B8953E"/>
         </w:pBdr>
       </w:pPr>
       <w:r>
@@ -173,7 +188,7 @@
           <w:rFonts w:ascii="Calibri" w:hAnsi="Calibri" w:eastAsia="Calibri"/>
           <w:b/>
           <w:color w:val="0A3A52"/>
-          <w:sz w:val="20"/>
+          <w:sz w:val="18"/>
         </w:rPr>
         <w:t>HIGHLIGHTS</w:t>
       </w:r>
@@ -181,14 +196,14 @@
     <w:p>
       <w:pPr>
         <w:pStyle w:val="ListBullet"/>
-        <w:spacing w:after="20"/>
+        <w:spacing w:after="0"/>
       </w:pPr>
       <w:r>
         <w:rPr>
           <w:rFonts w:ascii="Calibri" w:hAnsi="Calibri" w:eastAsia="Calibri"/>
           <w:b w:val="0"/>
           <w:color w:val="1F2A37"/>
-          <w:sz w:val="18"/>
+          <w:sz w:val="16"/>
         </w:rPr>
         <w:t>30 years progressive HR &amp; executive management</w:t>
       </w:r>
@@ -196,14 +211,14 @@
     <w:p>
       <w:pPr>
         <w:pStyle w:val="ListBullet"/>
-        <w:spacing w:after="20"/>
+        <w:spacing w:after="0"/>
       </w:pPr>
       <w:r>
         <w:rPr>
           <w:rFonts w:ascii="Calibri" w:hAnsi="Calibri" w:eastAsia="Calibri"/>
           <w:b w:val="0"/>
           <w:color w:val="1F2A37"/>
-          <w:sz w:val="18"/>
+          <w:sz w:val="16"/>
         </w:rPr>
         <w:t>18+ years executive Human Resource leadership</w:t>
       </w:r>
@@ -211,29 +226,29 @@
     <w:p>
       <w:pPr>
         <w:pStyle w:val="ListBullet"/>
-        <w:spacing w:after="20"/>
+        <w:spacing w:after="0"/>
       </w:pPr>
       <w:r>
         <w:rPr>
           <w:rFonts w:ascii="Calibri" w:hAnsi="Calibri" w:eastAsia="Calibri"/>
           <w:b w:val="0"/>
           <w:color w:val="1F2A37"/>
-          <w:sz w:val="18"/>
+          <w:sz w:val="16"/>
         </w:rPr>
-        <w:t>HR leadership for 2,000+ staff across 50+ units</w:t>
+        <w:t>Strategic HR for 2,000+ employees / 50+ units</w:t>
       </w:r>
     </w:p>
     <w:p>
       <w:pPr>
         <w:pStyle w:val="ListBullet"/>
-        <w:spacing w:after="20"/>
+        <w:spacing w:after="0"/>
       </w:pPr>
       <w:r>
         <w:rPr>
           <w:rFonts w:ascii="Calibri" w:hAnsi="Calibri" w:eastAsia="Calibri"/>
           <w:b w:val="0"/>
           <w:color w:val="1F2A37"/>
-          <w:sz w:val="18"/>
+          <w:sz w:val="16"/>
         </w:rPr>
         <w:t>Founder &amp; MD, FairBanks Medical Centre Ltd</w:t>
       </w:r>
@@ -241,23 +256,68 @@
     <w:p>
       <w:pPr>
         <w:pStyle w:val="ListBullet"/>
-        <w:spacing w:after="20"/>
+        <w:spacing w:after="0"/>
       </w:pPr>
       <w:r>
         <w:rPr>
           <w:rFonts w:ascii="Calibri" w:hAnsi="Calibri" w:eastAsia="Calibri"/>
           <w:b w:val="0"/>
           <w:color w:val="1F2A37"/>
-          <w:sz w:val="18"/>
+          <w:sz w:val="16"/>
         </w:rPr>
         <w:t>Social enterprise reach: 10,000+ beneficiaries</w:t>
       </w:r>
     </w:p>
     <w:p>
       <w:pPr>
-        <w:spacing w:before="160" w:after="60"/>
+        <w:pStyle w:val="ListBullet"/>
+        <w:spacing w:after="0"/>
+      </w:pPr>
+      <w:r>
+        <w:rPr>
+          <w:rFonts w:ascii="Calibri" w:hAnsi="Calibri" w:eastAsia="Calibri"/>
+          <w:b w:val="0"/>
+          <w:color w:val="1F2A37"/>
+          <w:sz w:val="16"/>
+        </w:rPr>
+        <w:t>PhD Candidate — HR analytics, AI &amp; organisational behaviour</w:t>
+      </w:r>
+    </w:p>
+    <w:p>
+      <w:pPr>
+        <w:pStyle w:val="ListBullet"/>
+        <w:spacing w:after="0"/>
+      </w:pPr>
+      <w:r>
+        <w:rPr>
+          <w:rFonts w:ascii="Calibri" w:hAnsi="Calibri" w:eastAsia="Calibri"/>
+          <w:b w:val="0"/>
+          <w:color w:val="1F2A37"/>
+          <w:sz w:val="16"/>
+        </w:rPr>
+        <w:t>Executive advisor on change &amp; organisational effectiveness</w:t>
+      </w:r>
+    </w:p>
+    <w:p>
+      <w:pPr>
+        <w:pStyle w:val="ListBullet"/>
+        <w:spacing w:after="0"/>
+      </w:pPr>
+      <w:r>
+        <w:rPr>
+          <w:rFonts w:ascii="Calibri" w:hAnsi="Calibri" w:eastAsia="Calibri"/>
+          <w:b w:val="0"/>
+          <w:color w:val="1F2A37"/>
+          <w:sz w:val="16"/>
+        </w:rPr>
+        <w:t>Workforce planning, talent &amp; performance leadership</w:t>
+      </w:r>
+    </w:p>
+    <w:p>
+      <w:pPr>
+        <w:spacing w:before="120" w:after="40"/>
         <w:pBdr>
-          <w:bottom w:val="single" w:sz="10" w:space="1" w:color="B8953E"/>
+          <w:bottom w:val="single" w:sz="8" w:space="1" w:color="B8953E"/>
         </w:pBdr>
       </w:pPr>
       <w:r>
@@ -265,14 +325,14 @@
           <w:rFonts w:ascii="Calibri" w:hAnsi="Calibri" w:eastAsia="Calibri"/>
           <w:b/>
           <w:color w:val="0A3A52"/>
-          <w:sz w:val="20"/>
+          <w:sz w:val="18"/>
         </w:rPr>
-        <w:t>CORE COMPETENCIES</w:t>
+        <w:t>COMPETENCIES</w:t>
       </w:r>
     </w:p>
     <w:p>
       <w:pPr>
-        <w:spacing w:after="60"/>
+        <w:spacing w:after="40"/>
         <w:jc w:val="both"/>
       </w:pPr>
       <w:r>
@@ -280,16 +340,16 @@
           <w:rFonts w:ascii="Calibri" w:hAnsi="Calibri" w:eastAsia="Calibri"/>
           <w:b w:val="0"/>
           <w:color w:val="1F2A37"/>
-          <w:sz w:val="19"/>
+          <w:sz w:val="16"/>
         </w:rPr>
-        <w:t>HR Strategy  ·  Organisational Development  ·  Talent Management  ·  Workforce Planning  ·  Change Management  ·  Performance Management  ·  Employee Relations  ·  Corporate Governance  ·  Leadership Development  ·  HR Analytics / HRIS</w:t>
+        <w:t>HR Strategy  ·  Human Capital Management  ·  Organisational Development  ·  Talent Management  ·  Workforce Planning  ·  Succession Planning  ·  Change Management  ·  Performance Management  ·  Employee Relations  ·  Labour Law Compliance  ·  Corporate Governance  ·  Leadership Development  ·  HR Analytics / HRIS  ·  Stakeholder Engagement</w:t>
       </w:r>
     </w:p>
     <w:p>
       <w:pPr>
-        <w:spacing w:before="160" w:after="60"/>
+        <w:spacing w:before="120" w:after="40"/>
         <w:pBdr>
-          <w:bottom w:val="single" w:sz="10" w:space="1" w:color="B8953E"/>
+          <w:bottom w:val="single" w:sz="8" w:space="1" w:color="B8953E"/>
         </w:pBdr>
       </w:pPr>
       <w:r>
@@ -297,21 +357,21 @@
           <w:rFonts w:ascii="Calibri" w:hAnsi="Calibri" w:eastAsia="Calibri"/>
           <w:b/>
           <w:color w:val="0A3A52"/>
-          <w:sz w:val="20"/>
+          <w:sz w:val="18"/>
         </w:rPr>
         <w:t>EXPERIENCE</w:t>
       </w:r>
     </w:p>
     <w:p>
       <w:pPr>
-        <w:spacing w:before="80"/>
+        <w:spacing w:before="60"/>
       </w:pPr>
       <w:r>
         <w:rPr>
           <w:rFonts w:ascii="Calibri" w:hAnsi="Calibri" w:eastAsia="Calibri"/>
           <w:b/>
           <w:color w:val="0A3A52"/>
-          <w:sz w:val="19"/>
+          <w:sz w:val="18"/>
         </w:rPr>
         <w:t>Founder, Managing Director &amp; Executive HR Leader</w:t>
       </w:r>
@@ -322,36 +382,51 @@
           <w:rFonts w:ascii="Calibri" w:hAnsi="Calibri" w:eastAsia="Calibri"/>
           <w:b w:val="0"/>
           <w:color w:val="1F6F78"/>
-          <w:sz w:val="17"/>
+          <w:sz w:val="16"/>
         </w:rPr>
         <w:t>FairBanks Medical Centre Ltd  |  2025 - Present</w:t>
       </w:r>
     </w:p>
     <w:p>
       <w:pPr>
-        <w:spacing w:after="60"/>
-        <w:jc w:val="both"/>
+        <w:pStyle w:val="ListBullet"/>
+        <w:spacing w:after="0"/>
       </w:pPr>
       <w:r>
         <w:rPr>
           <w:rFonts w:ascii="Calibri" w:hAnsi="Calibri" w:eastAsia="Calibri"/>
           <w:b w:val="0"/>
           <w:color w:val="1F2A37"/>
-          <w:sz w:val="18"/>
+          <w:sz w:val="16"/>
         </w:rPr>
-        <w:t>Strategy, governance, HR and growth; founded social enterprise (10,000+ beneficiaries).</w:t>
+        <w:t>Lead strategy, governance, HR systems and institutional growth.</w:t>
       </w:r>
     </w:p>
     <w:p>
       <w:pPr>
-        <w:spacing w:before="80"/>
+        <w:pStyle w:val="ListBullet"/>
+        <w:spacing w:after="0"/>
+      </w:pPr>
+      <w:r>
+        <w:rPr>
+          <w:rFonts w:ascii="Calibri" w:hAnsi="Calibri" w:eastAsia="Calibri"/>
+          <w:b w:val="0"/>
+          <w:color w:val="1F2A37"/>
+          <w:sz w:val="16"/>
+        </w:rPr>
+        <w:t>Founded FairBanks Social Enterprise Initiative (10,000+ beneficiaries).</w:t>
+      </w:r>
+    </w:p>
+    <w:p>
+      <w:pPr>
+        <w:spacing w:before="60"/>
       </w:pPr>
       <w:r>
         <w:rPr>
           <w:rFonts w:ascii="Calibri" w:hAnsi="Calibri" w:eastAsia="Calibri"/>
           <w:b/>
           <w:color w:val="0A3A52"/>
-          <w:sz w:val="19"/>
+          <w:sz w:val="18"/>
         </w:rPr>
         <w:t>Group Human Resource &amp; Administration Manager</w:t>
       </w:r>
@@ -362,36 +437,51 @@
           <w:rFonts w:ascii="Calibri" w:hAnsi="Calibri" w:eastAsia="Calibri"/>
           <w:b w:val="0"/>
           <w:color w:val="1F6F78"/>
-          <w:sz w:val="17"/>
+          <w:sz w:val="16"/>
         </w:rPr>
         <w:t>Norvik Group  |  Jul 2016 - Feb 2026</w:t>
       </w:r>
     </w:p>
     <w:p>
       <w:pPr>
-        <w:spacing w:after="60"/>
-        <w:jc w:val="both"/>
+        <w:pStyle w:val="ListBullet"/>
+        <w:spacing w:after="0"/>
       </w:pPr>
       <w:r>
         <w:rPr>
           <w:rFonts w:ascii="Calibri" w:hAnsi="Calibri" w:eastAsia="Calibri"/>
           <w:b w:val="0"/>
           <w:color w:val="1F2A37"/>
-          <w:sz w:val="18"/>
+          <w:sz w:val="16"/>
         </w:rPr>
-        <w:t>Directed Group HR for 2,000+ employees; led workforce planning and leadership development.</w:t>
+        <w:t>Directed Group HR strategy for 2,000+ employees across 50+ units.</w:t>
       </w:r>
     </w:p>
     <w:p>
       <w:pPr>
-        <w:spacing w:before="80"/>
+        <w:pStyle w:val="ListBullet"/>
+        <w:spacing w:after="0"/>
+      </w:pPr>
+      <w:r>
+        <w:rPr>
+          <w:rFonts w:ascii="Calibri" w:hAnsi="Calibri" w:eastAsia="Calibri"/>
+          <w:b w:val="0"/>
+          <w:color w:val="1F2A37"/>
+          <w:sz w:val="16"/>
+        </w:rPr>
+        <w:t>Led workforce planning, restructuring, succession and leadership development.</w:t>
+      </w:r>
+    </w:p>
+    <w:p>
+      <w:pPr>
+        <w:spacing w:before="60"/>
       </w:pPr>
       <w:r>
         <w:rPr>
           <w:rFonts w:ascii="Calibri" w:hAnsi="Calibri" w:eastAsia="Calibri"/>
           <w:b/>
           <w:color w:val="0A3A52"/>
-          <w:sz w:val="19"/>
+          <w:sz w:val="18"/>
         </w:rPr>
         <w:t>Human Resource &amp; Administration Manager</w:t>
       </w:r>
@@ -402,36 +492,51 @@
           <w:rFonts w:ascii="Calibri" w:hAnsi="Calibri" w:eastAsia="Calibri"/>
           <w:b w:val="0"/>
           <w:color w:val="1F6F78"/>
-          <w:sz w:val="17"/>
+          <w:sz w:val="16"/>
         </w:rPr>
         <w:t>Norvik Hospital Ltd  |  Sep 2013 - 2016</w:t>
       </w:r>
     </w:p>
     <w:p>
       <w:pPr>
-        <w:spacing w:after="60"/>
-        <w:jc w:val="both"/>
+        <w:pStyle w:val="ListBullet"/>
+        <w:spacing w:after="0"/>
       </w:pPr>
       <w:r>
         <w:rPr>
           <w:rFonts w:ascii="Calibri" w:hAnsi="Calibri" w:eastAsia="Calibri"/>
           <w:b w:val="0"/>
           <w:color w:val="1F2A37"/>
-          <w:sz w:val="18"/>
+          <w:sz w:val="16"/>
         </w:rPr>
-        <w:t>Led recruitment, employee relations, performance systems and HR policy.</w:t>
+        <w:t>Led recruitment, employee relations, appraisals and staff welfare.</w:t>
       </w:r>
     </w:p>
     <w:p>
       <w:pPr>
-        <w:spacing w:before="80"/>
+        <w:pStyle w:val="ListBullet"/>
+        <w:spacing w:after="0"/>
+      </w:pPr>
+      <w:r>
+        <w:rPr>
+          <w:rFonts w:ascii="Calibri" w:hAnsi="Calibri" w:eastAsia="Calibri"/>
+          <w:b w:val="0"/>
+          <w:color w:val="1F2A37"/>
+          <w:sz w:val="16"/>
+        </w:rPr>
+        <w:t>Improved HR policy implementation and operational efficiency.</w:t>
+      </w:r>
+    </w:p>
+    <w:p>
+      <w:pPr>
+        <w:spacing w:before="60"/>
       </w:pPr>
       <w:r>
         <w:rPr>
           <w:rFonts w:ascii="Calibri" w:hAnsi="Calibri" w:eastAsia="Calibri"/>
           <w:b/>
           <w:color w:val="0A3A52"/>
-          <w:sz w:val="19"/>
+          <w:sz w:val="18"/>
         </w:rPr>
         <w:t>Human Resource Manager</w:t>
       </w:r>
@@ -442,14 +547,76 @@
           <w:rFonts w:ascii="Calibri" w:hAnsi="Calibri" w:eastAsia="Calibri"/>
           <w:b w:val="0"/>
           <w:color w:val="1F6F78"/>
-          <w:sz w:val="17"/>
+          <w:sz w:val="16"/>
         </w:rPr>
         <w:t>St. Catherine's Hospital  |  2007 - 2010</w:t>
       </w:r>
     </w:p>
     <w:p>
       <w:pPr>
-        <w:spacing w:after="60"/>
+        <w:pStyle w:val="ListBullet"/>
+        <w:spacing w:after="0"/>
+      </w:pPr>
+      <w:r>
+        <w:rPr>
+          <w:rFonts w:ascii="Calibri" w:hAnsi="Calibri" w:eastAsia="Calibri"/>
+          <w:b w:val="0"/>
+          <w:color w:val="1F2A37"/>
+          <w:sz w:val="16"/>
+        </w:rPr>
+        <w:t>Managed HR operations, welfare programmes and labour compliance.</w:t>
+      </w:r>
+    </w:p>
+    <w:p>
+      <w:pPr>
+        <w:pStyle w:val="ListBullet"/>
+        <w:spacing w:after="0"/>
+      </w:pPr>
+      <w:r>
+        <w:rPr>
+          <w:rFonts w:ascii="Calibri" w:hAnsi="Calibri" w:eastAsia="Calibri"/>
+          <w:b w:val="0"/>
+          <w:color w:val="1F2A37"/>
+          <w:sz w:val="16"/>
+        </w:rPr>
+        <w:t>Strengthened recruitment, retention and employee engagement.</w:t>
+      </w:r>
+    </w:p>
+    <w:p>
+      <w:pPr>
+        <w:spacing w:after="40"/>
+        <w:jc w:val="both"/>
+      </w:pPr>
+      <w:r>
+        <w:rPr>
+          <w:rFonts w:ascii="Calibri" w:hAnsi="Calibri" w:eastAsia="Calibri"/>
+          <w:b w:val="0"/>
+          <w:color w:val="5B6B7C"/>
+          <w:sz w:val="15"/>
+        </w:rPr>
+        <w:t>Earlier roles: Health Management Systems Administrator, St. Catherine's Hospital (2010-2013); Human Resource Assistant, E Power Limited (1997-2000).</w:t>
+      </w:r>
+    </w:p>
+    <w:p>
+      <w:pPr>
+        <w:spacing w:before="120" w:after="40"/>
+        <w:pBdr>
+          <w:bottom w:val="single" w:sz="8" w:space="1" w:color="B8953E"/>
+        </w:pBdr>
+      </w:pPr>
+      <w:r>
+        <w:rPr>
+          <w:rFonts w:ascii="Calibri" w:hAnsi="Calibri" w:eastAsia="Calibri"/>
+          <w:b/>
+          <w:color w:val="0A3A52"/>
+          <w:sz w:val="18"/>
+        </w:rPr>
+        <w:t>EDUCATION</w:t>
+      </w:r>
+    </w:p>
+    <w:p>
+      <w:pPr>
+        <w:spacing w:after="40"/>
         <w:jc w:val="both"/>
       </w:pPr>
       <w:r>
@@ -457,14 +624,76 @@
           <w:rFonts w:ascii="Calibri" w:hAnsi="Calibri" w:eastAsia="Calibri"/>
           <w:b w:val="0"/>
           <w:color w:val="1F2A37"/>
-          <w:sz w:val="18"/>
+          <w:sz w:val="16"/>
         </w:rPr>
-        <w:t>Managed HR operations, welfare and labour compliance.</w:t>
+        <w:t>PhD in Management (Ongoing) — Uganda Christian University. Research: Machine learning prediction of occupational burnout among medical practitioners</w:t>
       </w:r>
     </w:p>
     <w:p>
       <w:pPr>
-        <w:spacing w:after="60"/>
+        <w:spacing w:after="40"/>
+        <w:jc w:val="both"/>
+      </w:pPr>
+      <w:r>
+        <w:rPr>
+          <w:rFonts w:ascii="Calibri" w:hAnsi="Calibri" w:eastAsia="Calibri"/>
+          <w:b w:val="0"/>
+          <w:color w:val="1F2A37"/>
+          <w:sz w:val="16"/>
+        </w:rPr>
+        <w:t>Master of Social Sector Planning and Management — Makerere University</w:t>
+      </w:r>
+    </w:p>
+    <w:p>
+      <w:pPr>
+        <w:spacing w:after="40"/>
+        <w:jc w:val="both"/>
+      </w:pPr>
+      <w:r>
+        <w:rPr>
+          <w:rFonts w:ascii="Calibri" w:hAnsi="Calibri" w:eastAsia="Calibri"/>
+          <w:b w:val="0"/>
+          <w:color w:val="1F2A37"/>
+          <w:sz w:val="16"/>
+        </w:rPr>
+        <w:t>Bachelor of Arts in Social Sciences — Makerere University</w:t>
+      </w:r>
+    </w:p>
+    <w:p>
+      <w:pPr>
+        <w:spacing w:before="120" w:after="40"/>
+        <w:pBdr>
+          <w:bottom w:val="single" w:sz="8" w:space="1" w:color="B8953E"/>
+        </w:pBdr>
+      </w:pPr>
+      <w:r>
+        <w:rPr>
+          <w:rFonts w:ascii="Calibri" w:hAnsi="Calibri" w:eastAsia="Calibri"/>
+          <w:b/>
+          <w:color w:val="0A3A52"/>
+          <w:sz w:val="18"/>
+        </w:rPr>
+        <w:t>TECHNICAL &amp; ADDITIONAL</w:t>
+      </w:r>
+    </w:p>
+    <w:p>
+      <w:pPr>
+        <w:spacing w:after="40"/>
+        <w:jc w:val="both"/>
+      </w:pPr>
+      <w:r>
+        <w:rPr>
+          <w:rFonts w:ascii="Calibri" w:hAnsi="Calibri" w:eastAsia="Calibri"/>
+          <w:b w:val="0"/>
+          <w:color w:val="1F2A37"/>
+          <w:sz w:val="16"/>
+        </w:rPr>
+        <w:t>Microsoft Office  ·  HRIS  ·  ERP  ·  HR Analytics  ·  Performance systems  ·  Payroll systems  ·  Executive reporting  ·  AI applications in HR</w:t>
+      </w:r>
+    </w:p>
+    <w:p>
+      <w:pPr>
+        <w:spacing w:after="40"/>
         <w:jc w:val="both"/>
       </w:pPr>
       <w:r>
@@ -474,76 +703,12 @@
           <w:color w:val="5B6B7C"/>
           <w:sz w:val="16"/>
         </w:rPr>
-        <w:t>Earlier: Health Systems Administrator, St. Catherine's (2010-2013); HR Assistant, E Power Limited (1997-2000).</w:t>
-      </w:r>
-    </w:p>
-    <w:p>
-      <w:pPr>
-        <w:spacing w:before="160" w:after="60"/>
-        <w:pBdr>
-          <w:bottom w:val="single" w:sz="10" w:space="1" w:color="B8953E"/>
-        </w:pBdr>
-      </w:pPr>
-      <w:r>
-        <w:rPr>
-          <w:rFonts w:ascii="Calibri" w:hAnsi="Calibri" w:eastAsia="Calibri"/>
-          <w:b/>
-          <w:color w:val="0A3A52"/>
-          <w:sz w:val="20"/>
-        </w:rPr>
-        <w:t>EDUCATION</w:t>
-      </w:r>
-    </w:p>
-    <w:p>
-      <w:pPr>
-        <w:spacing w:after="60"/>
-        <w:jc w:val="both"/>
-      </w:pPr>
-      <w:r>
-        <w:rPr>
-          <w:rFonts w:ascii="Calibri" w:hAnsi="Calibri" w:eastAsia="Calibri"/>
-          <w:b w:val="0"/>
-          <w:color w:val="1F2A37"/>
-          <w:sz w:val="19"/>
-        </w:rPr>
-        <w:t>PhD Management (Ongoing), Uganda Christian University  ·  MSSPM, Makerere University  ·  BA Social Sciences, Makerere University</w:t>
-      </w:r>
-    </w:p>
-    <w:p>
-      <w:pPr>
-        <w:spacing w:before="160" w:after="60"/>
-        <w:pBdr>
-          <w:bottom w:val="single" w:sz="10" w:space="1" w:color="B8953E"/>
-        </w:pBdr>
-      </w:pPr>
-      <w:r>
-        <w:rPr>
-          <w:rFonts w:ascii="Calibri" w:hAnsi="Calibri" w:eastAsia="Calibri"/>
-          <w:b/>
-          <w:color w:val="0A3A52"/>
-          <w:sz w:val="20"/>
-        </w:rPr>
-        <w:t>ADDITIONAL</w:t>
-      </w:r>
-    </w:p>
-    <w:p>
-      <w:pPr>
-        <w:spacing w:after="60"/>
-        <w:jc w:val="both"/>
-      </w:pPr>
-      <w:r>
-        <w:rPr>
-          <w:rFonts w:ascii="Calibri" w:hAnsi="Calibri" w:eastAsia="Calibri"/>
-          <w:b w:val="0"/>
-          <w:color w:val="5B6B7C"/>
-          <w:sz w:val="17"/>
-        </w:rPr>
-        <w:t>Member, Federation of Uganda Employers (FUE)  ·  English &amp; Luganda (Fluent)  ·  References on request</w:t>
+        <w:t>Member, Federation of Uganda Employers (FUE)  ·  English (Fluent)  ·  Luganda (Fluent)  ·  References available on request</w:t>
       </w:r>
     </w:p>
     <w:sectPr>
       <w:pgSz w:w="12240" w:h="15840"/>
-      <w:pgMar w:top="794" w:right="850" w:bottom="794" w:left="850" w:header="720" w:footer="720" w:gutter="0"/>
+      <w:pgMar w:top="567" w:right="680" w:bottom="567" w:left="680" w:header="720" w:footer="720" w:gutter="0"/>
       <w:cols w:space="720"/>
       <w:docGrid w:linePitch="360"/>
     </w:sectPr>

</xml_diff>

<commit_message>
Improve CV readability and page balance
Enlarge typography, strengthen visual hierarchy, and use each one-page layout more effectively while preserving clear, complete portraits.

Co-authored-by: Cursor <cursoragent@cursor.com>
</commit_message>
<xml_diff>
--- a/racheal_cv/brief_versions/01_classic_airy/racheal_cv.docx
+++ b/racheal_cv/brief_versions/01_classic_airy/racheal_cv.docx
@@ -700,6 +700,21 @@
         <w:rPr>
           <w:rFonts w:ascii="Calibri" w:hAnsi="Calibri" w:eastAsia="Calibri"/>
           <w:b w:val="0"/>
+          <w:color w:val="1F2A37"/>
+          <w:sz w:val="16"/>
+        </w:rPr>
+        <w:t>Human Resource Analytics  ·  Artificial Intelligence  ·  Machine Learning  ·  Organisational Behaviour  ·  Occupational Burnout  ·  Employee Wellbeing  ·  Healthcare Management</w:t>
+      </w:r>
+    </w:p>
+    <w:p>
+      <w:pPr>
+        <w:spacing w:after="40"/>
+        <w:jc w:val="both"/>
+      </w:pPr>
+      <w:r>
+        <w:rPr>
+          <w:rFonts w:ascii="Calibri" w:hAnsi="Calibri" w:eastAsia="Calibri"/>
+          <w:b w:val="0"/>
           <w:color w:val="5B6B7C"/>
           <w:sz w:val="16"/>
         </w:rPr>

</xml_diff>

<commit_message>
Refine one-page CV typography and spacing
Reduce repeated content and enlarge text so all five designs remain clear, balanced, and readable on one page.

Co-authored-by: Cursor <cursoragent@cursor.com>
</commit_message>
<xml_diff>
--- a/racheal_cv/brief_versions/01_classic_airy/racheal_cv.docx
+++ b/racheal_cv/brief_versions/01_classic_airy/racheal_cv.docx
@@ -205,7 +205,7 @@
           <w:color w:val="1F2A37"/>
           <w:sz w:val="16"/>
         </w:rPr>
-        <w:t>30 years progressive HR &amp; executive management</w:t>
+        <w:t>Nearly 30 years in HR and executive management</w:t>
       </w:r>
     </w:p>
     <w:p>
@@ -220,7 +220,7 @@
           <w:color w:val="1F2A37"/>
           <w:sz w:val="16"/>
         </w:rPr>
-        <w:t>18+ years executive Human Resource leadership</w:t>
+        <w:t>18+ years in executive Human Resource leadership</w:t>
       </w:r>
     </w:p>
     <w:p>
@@ -235,7 +235,7 @@
           <w:color w:val="1F2A37"/>
           <w:sz w:val="16"/>
         </w:rPr>
-        <w:t>Strategic HR for 2,000+ employees / 50+ units</w:t>
+        <w:t>Strategic HR leadership for 2,000+ employees across 50+ units</w:t>
       </w:r>
     </w:p>
     <w:p>
@@ -270,51 +270,6 @@
     </w:p>
     <w:p>
       <w:pPr>
-        <w:pStyle w:val="ListBullet"/>
-        <w:spacing w:after="0"/>
-      </w:pPr>
-      <w:r>
-        <w:rPr>
-          <w:rFonts w:ascii="Calibri" w:hAnsi="Calibri" w:eastAsia="Calibri"/>
-          <w:b w:val="0"/>
-          <w:color w:val="1F2A37"/>
-          <w:sz w:val="16"/>
-        </w:rPr>
-        <w:t>PhD Candidate — HR analytics, AI &amp; organisational behaviour</w:t>
-      </w:r>
-    </w:p>
-    <w:p>
-      <w:pPr>
-        <w:pStyle w:val="ListBullet"/>
-        <w:spacing w:after="0"/>
-      </w:pPr>
-      <w:r>
-        <w:rPr>
-          <w:rFonts w:ascii="Calibri" w:hAnsi="Calibri" w:eastAsia="Calibri"/>
-          <w:b w:val="0"/>
-          <w:color w:val="1F2A37"/>
-          <w:sz w:val="16"/>
-        </w:rPr>
-        <w:t>Executive advisor on change &amp; organisational effectiveness</w:t>
-      </w:r>
-    </w:p>
-    <w:p>
-      <w:pPr>
-        <w:pStyle w:val="ListBullet"/>
-        <w:spacing w:after="0"/>
-      </w:pPr>
-      <w:r>
-        <w:rPr>
-          <w:rFonts w:ascii="Calibri" w:hAnsi="Calibri" w:eastAsia="Calibri"/>
-          <w:b w:val="0"/>
-          <w:color w:val="1F2A37"/>
-          <w:sz w:val="16"/>
-        </w:rPr>
-        <w:t>Workforce planning, talent &amp; performance leadership</w:t>
-      </w:r>
-    </w:p>
-    <w:p>
-      <w:pPr>
         <w:spacing w:before="120" w:after="40"/>
         <w:pBdr>
           <w:bottom w:val="single" w:sz="8" w:space="1" w:color="B8953E"/>
@@ -342,7 +297,7 @@
           <w:color w:val="1F2A37"/>
           <w:sz w:val="16"/>
         </w:rPr>
-        <w:t>HR Strategy  ·  Human Capital Management  ·  Organisational Development  ·  Talent Management  ·  Workforce Planning  ·  Succession Planning  ·  Change Management  ·  Performance Management  ·  Employee Relations  ·  Labour Law Compliance  ·  Corporate Governance  ·  Leadership Development  ·  HR Analytics / HRIS  ·  Stakeholder Engagement</w:t>
+        <w:t>HR Strategy  ·  Organisational Development  ·  Talent Management  ·  Workforce Planning  ·  Change Management  ·  Performance Management  ·  Employee Relations  ·  Corporate Governance  ·  Leadership Development  ·  HR Analytics / HRIS</w:t>
       </w:r>
     </w:p>
     <w:p>
@@ -509,22 +464,7 @@
           <w:color w:val="1F2A37"/>
           <w:sz w:val="16"/>
         </w:rPr>
-        <w:t>Led recruitment, employee relations, appraisals and staff welfare.</w:t>
-      </w:r>
-    </w:p>
-    <w:p>
-      <w:pPr>
-        <w:pStyle w:val="ListBullet"/>
-        <w:spacing w:after="0"/>
-      </w:pPr>
-      <w:r>
-        <w:rPr>
-          <w:rFonts w:ascii="Calibri" w:hAnsi="Calibri" w:eastAsia="Calibri"/>
-          <w:b w:val="0"/>
-          <w:color w:val="1F2A37"/>
-          <w:sz w:val="16"/>
-        </w:rPr>
-        <w:t>Improved HR policy implementation and operational efficiency.</w:t>
+        <w:t>Led recruitment, employee relations, performance systems and HR policy.</w:t>
       </w:r>
     </w:p>
     <w:p>
@@ -564,22 +504,7 @@
           <w:color w:val="1F2A37"/>
           <w:sz w:val="16"/>
         </w:rPr>
-        <w:t>Managed HR operations, welfare programmes and labour compliance.</w:t>
-      </w:r>
-    </w:p>
-    <w:p>
-      <w:pPr>
-        <w:pStyle w:val="ListBullet"/>
-        <w:spacing w:after="0"/>
-      </w:pPr>
-      <w:r>
-        <w:rPr>
-          <w:rFonts w:ascii="Calibri" w:hAnsi="Calibri" w:eastAsia="Calibri"/>
-          <w:b w:val="0"/>
-          <w:color w:val="1F2A37"/>
-          <w:sz w:val="16"/>
-        </w:rPr>
-        <w:t>Strengthened recruitment, retention and employee engagement.</w:t>
+        <w:t>Managed HR operations, welfare, labour compliance and staff engagement.</w:t>
       </w:r>
     </w:p>
     <w:p>
@@ -688,7 +613,7 @@
           <w:color w:val="1F2A37"/>
           <w:sz w:val="16"/>
         </w:rPr>
-        <w:t>Microsoft Office  ·  HRIS  ·  ERP  ·  HR Analytics  ·  Performance systems  ·  Payroll systems  ·  Executive reporting  ·  AI applications in HR</w:t>
+        <w:t>Microsoft Office  ·  HRIS  ·  ERP  ·  HR Analytics  ·  Performance systems  ·  Executive reporting  ·  AI applications in HR</w:t>
       </w:r>
     </w:p>
     <w:p>
@@ -703,7 +628,7 @@
           <w:color w:val="1F2A37"/>
           <w:sz w:val="16"/>
         </w:rPr>
-        <w:t>Human Resource Analytics  ·  Artificial Intelligence  ·  Machine Learning  ·  Organisational Behaviour  ·  Occupational Burnout  ·  Employee Wellbeing  ·  Healthcare Management</w:t>
+        <w:t>Human Resource Analytics  ·  Artificial Intelligence  ·  Organisational Behaviour  ·  Occupational Burnout  ·  Employee Wellbeing</w:t>
       </w:r>
     </w:p>
     <w:p>

</xml_diff>